<commit_message>
Bolt resume/cover letter: match base formatting, remove em dashes
</commit_message>
<xml_diff>
--- a/applications/bolt-new__senior-applied-engineer/bolt-new-resume.docx
+++ b/applications/bolt-new__senior-applied-engineer/bolt-new-resume.docx
@@ -273,7 +273,7 @@
         </w:r>
       </w:hyperlink>
       <w:r>
-        <w:t xml:space="preserve">  —  Remote</w:t>
+        <w:t xml:space="preserve">  |  Remote</w:t>
       </w:r>
     </w:p>
     <w:p>
@@ -291,7 +291,7 @@
         <w:t xml:space="preserve">Senior AI/ML Engineer, Lead Architect</w:t>
       </w:r>
       <w:r>
-        <w:t xml:space="preserve">  —  </w:t>
+        <w:t xml:space="preserve">  |  </w:t>
       </w:r>
       <w:r>
         <w:rPr>
@@ -522,7 +522,7 @@
           <w:b/>
           <w:bCs/>
         </w:rPr>
-        <w:t xml:space="preserve">Client —</w:t>
+        <w:t xml:space="preserve">Client:</w:t>
       </w:r>
       <w:r>
         <w:rPr>
@@ -553,7 +553,7 @@
           <w:b/>
           <w:bCs/>
         </w:rPr>
-        <w:t xml:space="preserve">(current) — Lease Abstraction:</w:t>
+        <w:t xml:space="preserve">(current), Lease Abstraction.</w:t>
       </w:r>
       <w:r>
         <w:t xml:space="preserve"> </w:t>
@@ -668,7 +668,7 @@
           <w:b/>
           <w:bCs/>
         </w:rPr>
-        <w:t xml:space="preserve">Client —</w:t>
+        <w:t xml:space="preserve">Client:</w:t>
       </w:r>
       <w:r>
         <w:rPr>
@@ -699,7 +699,7 @@
           <w:b/>
           <w:bCs/>
         </w:rPr>
-        <w:t xml:space="preserve">(GenAI Platform):</w:t>
+        <w:t xml:space="preserve">(GenAI Platform).</w:t>
       </w:r>
       <w:r>
         <w:t xml:space="preserve"> </w:t>
@@ -764,7 +764,7 @@
         </m:r>
       </m:oMath>
       <w:r>
-        <w:t xml:space="preserve">60% to deterministic regex/rule-based parsers, reserving the LLM for the rest — cutting token spend</w:t>
+        <w:t xml:space="preserve">60% to deterministic regex/rule-based parsers, reserving the LLM for the rest, cutting token spend</w:t>
       </w:r>
       <w:r>
         <w:t xml:space="preserve"> </w:t>
@@ -885,7 +885,7 @@
         <w:t xml:space="preserve"> </w:t>
       </w:r>
       <w:r>
-        <w:t xml:space="preserve">over the top candidates — improving</w:t>
+        <w:t xml:space="preserve">over the top candidates, improving</w:t>
       </w:r>
       <w:r>
         <w:t xml:space="preserve"> </w:t>
@@ -1081,7 +1081,7 @@
         <w:t xml:space="preserve">Kuttl (Incubated at IIM Lucknow)</w:t>
       </w:r>
       <w:r>
-        <w:t xml:space="preserve">  —  Remote</w:t>
+        <w:t xml:space="preserve">  |  Remote</w:t>
       </w:r>
     </w:p>
     <w:p>
@@ -1099,7 +1099,7 @@
         <w:t xml:space="preserve">Founding Engineer</w:t>
       </w:r>
       <w:r>
-        <w:t xml:space="preserve">  —  </w:t>
+        <w:t xml:space="preserve">  |  </w:t>
       </w:r>
       <w:r>
         <w:rPr>
@@ -1421,7 +1421,7 @@
         </w:r>
       </w:hyperlink>
       <w:r>
-        <w:t xml:space="preserve">  —  Bengaluru, India</w:t>
+        <w:t xml:space="preserve">  |  Bengaluru, India</w:t>
       </w:r>
     </w:p>
     <w:p>
@@ -1439,7 +1439,7 @@
         <w:t xml:space="preserve">SDE-2</w:t>
       </w:r>
       <w:r>
-        <w:t xml:space="preserve">  —  </w:t>
+        <w:t xml:space="preserve">  |  </w:t>
       </w:r>
       <w:r>
         <w:rPr>
@@ -1650,7 +1650,7 @@
         </w:r>
       </w:hyperlink>
       <w:r>
-        <w:t xml:space="preserve">  —  Bengaluru, India</w:t>
+        <w:t xml:space="preserve">  |  Bengaluru, India</w:t>
       </w:r>
     </w:p>
     <w:p>
@@ -1668,7 +1668,7 @@
         <w:t xml:space="preserve">Software Development Engineer (SDE)</w:t>
       </w:r>
       <w:r>
-        <w:t xml:space="preserve">  —  </w:t>
+        <w:t xml:space="preserve">  |  </w:t>
       </w:r>
       <w:r>
         <w:rPr>
@@ -1887,7 +1887,7 @@
         </w:r>
       </w:hyperlink>
       <w:r>
-        <w:t xml:space="preserve">  —  Remote, India</w:t>
+        <w:t xml:space="preserve">  |  Remote, India</w:t>
       </w:r>
     </w:p>
     <w:p>
@@ -1905,7 +1905,7 @@
         <w:t xml:space="preserve">Associate Data Engineer</w:t>
       </w:r>
       <w:r>
-        <w:t xml:space="preserve">  —  </w:t>
+        <w:t xml:space="preserve">  |  </w:t>
       </w:r>
       <w:r>
         <w:rPr>
@@ -2045,7 +2045,7 @@
         </w:r>
       </w:hyperlink>
       <w:r>
-        <w:t xml:space="preserve">  —  Delhi, India</w:t>
+        <w:t xml:space="preserve">  |  Delhi, India</w:t>
       </w:r>
     </w:p>
     <w:p>
@@ -2063,7 +2063,7 @@
         <w:t xml:space="preserve">B.Tech in Computer Science &amp; Engineering</w:t>
       </w:r>
       <w:r>
-        <w:t xml:space="preserve">  —  </w:t>
+        <w:t xml:space="preserve">  |  </w:t>
       </w:r>
       <w:r>
         <w:rPr>

</xml_diff>

<commit_message>
Fix DOCX formatting: convert inline math (sim/pipe/arrow) to DOCX-safe text
</commit_message>
<xml_diff>
--- a/applications/bolt-new__senior-applied-engineer/bolt-new-resume.docx
+++ b/applications/bolt-new__senior-applied-engineer/bolt-new-resume.docx
@@ -132,21 +132,7 @@
         <w:pStyle w:val="FirstParagraph"/>
       </w:pPr>
       <w:r>
-        <w:t xml:space="preserve">Senior Applied/GenAI Engineer with 5+ years building production-ready systems, specializing in AI agents that turn natural language into working software. Builds multi-step agent workflows with tool/function calling, context management (sub-agents, retrieval-based context, sliding windows), and structured outputs across multiple LLM providers (OpenAI GPT, Anthropic Claude). Data-driven on prompt engineering and automated LLM evaluation, having cut inference costs by</w:t>
-      </w:r>
-      <w:r>
-        <w:t xml:space="preserve"> </w:t>
-      </w:r>
-      <m:oMath>
-        <m:r>
-          <m:rPr>
-            <m:sty m:val="p"/>
-          </m:rPr>
-          <m:t>∼</m:t>
-        </m:r>
-      </m:oMath>
-      <w:r>
-        <w:t xml:space="preserve">90% while taking experimental AI to reliable enterprise production.</w:t>
+        <w:t xml:space="preserve">Senior Applied/GenAI Engineer with 5+ years building production-ready systems, specializing in AI agents that turn natural language into working software. Builds multi-step agent workflows with tool/function calling, context management (sub-agents, retrieval-based context, sliding windows), and structured outputs across multiple LLM providers (OpenAI GPT, Anthropic Claude). Data-driven on prompt engineering and automated LLM evaluation, having cut inference costs by ~90% while taking experimental AI to reliable enterprise production.</w:t>
       </w:r>
     </w:p>
     <w:bookmarkEnd w:id="14"/>
@@ -494,20 +480,12 @@
       <w:r>
         <w:t xml:space="preserve"> </w:t>
       </w:r>
-      <m:oMath>
-        <m:r>
-          <m:rPr>
-            <m:sty m:val="p"/>
-          </m:rPr>
-          <m:t>∼</m:t>
-        </m:r>
-      </m:oMath>
-      <w:r>
-        <w:rPr>
-          <w:b/>
-          <w:bCs/>
-        </w:rPr>
-        <w:t xml:space="preserve">88% baseline</w:t>
+      <w:r>
+        <w:rPr>
+          <w:b/>
+          <w:bCs/>
+        </w:rPr>
+        <w:t xml:space="preserve">~88% baseline</w:t>
       </w:r>
       <w:r>
         <w:t xml:space="preserve">, unblocking downstream automation.</w:t>
@@ -622,20 +600,12 @@
       <w:r>
         <w:t xml:space="preserve"> </w:t>
       </w:r>
-      <m:oMath>
-        <m:r>
-          <m:rPr>
-            <m:sty m:val="p"/>
-          </m:rPr>
-          <m:t>∼</m:t>
-        </m:r>
-      </m:oMath>
-      <w:r>
-        <w:rPr>
-          <w:b/>
-          <w:bCs/>
-        </w:rPr>
-        <w:t xml:space="preserve">$45k/year</w:t>
+      <w:r>
+        <w:rPr>
+          <w:b/>
+          <w:bCs/>
+        </w:rPr>
+        <w:t xml:space="preserve">~$45k/year</w:t>
       </w:r>
       <w:r>
         <w:t xml:space="preserve">).</w:t>
@@ -744,35 +714,7 @@
         <w:t xml:space="preserve"> </w:t>
       </w:r>
       <w:r>
-        <w:t xml:space="preserve">that classifies each field by complexity and routes</w:t>
-      </w:r>
-      <w:r>
-        <w:t xml:space="preserve"> </w:t>
-      </w:r>
-      <m:oMath>
-        <m:r>
-          <m:rPr>
-            <m:sty m:val="p"/>
-          </m:rPr>
-          <m:t>∼</m:t>
-        </m:r>
-      </m:oMath>
-      <w:r>
-        <w:t xml:space="preserve">60% to deterministic rule-based parsers, reserving the LLM for the rest, quantitatively choosing the cheapest method per task and cutting token spend</w:t>
-      </w:r>
-      <w:r>
-        <w:t xml:space="preserve"> </w:t>
-      </w:r>
-      <m:oMath>
-        <m:r>
-          <m:rPr>
-            <m:sty m:val="p"/>
-          </m:rPr>
-          <m:t>∼</m:t>
-        </m:r>
-      </m:oMath>
-      <w:r>
-        <w:t xml:space="preserve">40% with no measurable accuracy loss.</w:t>
+        <w:t xml:space="preserve">that classifies each field by complexity and routes ~60% to deterministic rule-based parsers, reserving the LLM for the rest, quantitatively choosing the cheapest method per task and cutting token spend ~40% with no measurable accuracy loss.</w:t>
       </w:r>
       <w:r>
         <w:t xml:space="preserve"> </w:t>
@@ -889,58 +831,7 @@
           <w:b/>
           <w:bCs/>
         </w:rPr>
-        <w:t xml:space="preserve">NDCG@5 by</w:t>
-      </w:r>
-      <w:r>
-        <w:rPr>
-          <w:b/>
-          <w:bCs/>
-        </w:rPr>
-        <w:t xml:space="preserve"> </w:t>
-      </w:r>
-      <m:oMath>
-        <m:r>
-          <m:rPr>
-            <m:sty m:val="p"/>
-          </m:rPr>
-          <m:t>∼</m:t>
-        </m:r>
-      </m:oMath>
-      <w:r>
-        <w:rPr>
-          <w:b/>
-          <w:bCs/>
-        </w:rPr>
-        <w:t xml:space="preserve">15 points (0.71</w:t>
-      </w:r>
-      <w:r>
-        <w:rPr>
-          <w:b/>
-          <w:bCs/>
-        </w:rPr>
-        <w:t xml:space="preserve"> </w:t>
-      </w:r>
-      <m:oMath>
-        <m:r>
-          <m:rPr>
-            <m:sty m:val="p"/>
-          </m:rPr>
-          <m:t>→</m:t>
-        </m:r>
-      </m:oMath>
-      <w:r>
-        <w:rPr>
-          <w:b/>
-          <w:bCs/>
-        </w:rPr>
-        <w:t xml:space="preserve"> </w:t>
-      </w:r>
-      <w:r>
-        <w:rPr>
-          <w:b/>
-          <w:bCs/>
-        </w:rPr>
-        <w:t xml:space="preserve">0.86)</w:t>
+        <w:t xml:space="preserve">NDCG@5 by ~15 points (0.71 to 0.86)</w:t>
       </w:r>
       <w:r>
         <w:t xml:space="preserve">.</w:t>
@@ -1515,21 +1406,7 @@
         <w:t xml:space="preserve"> </w:t>
       </w:r>
       <w:r>
-        <w:t xml:space="preserve">quality gates that cut cyclomatic complexity</w:t>
-      </w:r>
-      <w:r>
-        <w:t xml:space="preserve"> </w:t>
-      </w:r>
-      <m:oMath>
-        <m:r>
-          <m:rPr>
-            <m:sty m:val="p"/>
-          </m:rPr>
-          <m:t>∼</m:t>
-        </m:r>
-      </m:oMath>
-      <w:r>
-        <w:t xml:space="preserve">42%.</w:t>
+        <w:t xml:space="preserve">quality gates that cut cyclomatic complexity ~42%.</w:t>
       </w:r>
       <w:r>
         <w:t xml:space="preserve"> </w:t>
@@ -1758,22 +1635,7 @@
           <w:b/>
           <w:bCs/>
         </w:rPr>
-        <w:t xml:space="preserve">25% (</w:t>
-      </w:r>
-      <m:oMath>
-        <m:r>
-          <m:rPr>
-            <m:sty m:val="p"/>
-          </m:rPr>
-          <m:t>∼</m:t>
-        </m:r>
-      </m:oMath>
-      <w:r>
-        <w:rPr>
-          <w:b/>
-          <w:bCs/>
-        </w:rPr>
-        <w:t xml:space="preserve">$100k/yr)</w:t>
+        <w:t xml:space="preserve">25% (~$100k/yr)</w:t>
       </w:r>
       <w:r>
         <w:t xml:space="preserve"> </w:t>
@@ -2017,21 +1879,7 @@
         <w:t xml:space="preserve"> </w:t>
       </w:r>
       <w:r>
-        <w:t xml:space="preserve">indexing strategies and aggregation queries, reducing query latency by</w:t>
-      </w:r>
-      <w:r>
-        <w:t xml:space="preserve"> </w:t>
-      </w:r>
-      <m:oMath>
-        <m:r>
-          <m:rPr>
-            <m:sty m:val="p"/>
-          </m:rPr>
-          <m:t>∼</m:t>
-        </m:r>
-      </m:oMath>
-      <w:r>
-        <w:t xml:space="preserve">40% to enable sub-second dashboard load times for brand performance analytics.</w:t>
+        <w:t xml:space="preserve">indexing strategies and aggregation queries, reducing query latency by ~40% to enable sub-second dashboard load times for brand performance analytics.</w:t>
       </w:r>
       <w:r>
         <w:t xml:space="preserve"> </w:t>

</xml_diff>